<commit_message>
Append HSESC application answers Q7-Q10: recruitment, inclusion, exclusion, locations
As-conducted throughout: gatekeeper recruitment for Stage 2, two-tier snowball for Stage 3, operational exclusions stated as operated, vulnerable-group acknowledgement, no-physical-site Stage 3.

Co-Authored-By: Claude Fable 5 <noreply@anthropic.com>
Claude-Session: https://claude.ai/code/session_01KoT3i8geZspYBMMKVYJUTG
</commit_message>
<xml_diff>
--- a/docs/thesis/ethics/HSESC_Application_Basics_Draft.docx
+++ b/docs/thesis/ethics/HSESC_Application_Basics_Draft.docx
@@ -153,6 +153,128 @@
     <w:p>
       <w:r>
         <w:t>Contribution to healthcare development. Fall-risk assessment is under-practised in Hong Kong relative to its preventive value; practitioner consultation in this programme confirms that ease of use, fear of unfavourable results and lack of perceived importance suppress uptake. The gamified, decoupled approach demonstrates a practicable route to repeatable, acceptable assessment for the population that most needs it. As AI-enabled health technology brings continuous monitoring and more frequent risk verdicts to older populations, design that prevents verdict-driven abandonment becomes a public-health concern: this programme provides the behavioural layer — the failure model and the design discipline — that such technologies will require to remain in sustained, beneficial use.</w:t>
+      </w:r>
+    </w:p>
+    <w:p>
+      <w:pPr>
+        <w:pStyle w:val="Heading1"/>
+      </w:pPr>
+      <w:r>
+        <w:t>7. How will subjects be recruited?</w:t>
+      </w:r>
+    </w:p>
+    <w:p>
+      <w:r>
+        <w:t>Recruitment was conducted per stage, as follows (procedures as conducted; see the timing statement in item 4).</w:t>
+      </w:r>
+    </w:p>
+    <w:p>
+      <w:r>
+        <w:t>Stage 1 (survey): invitations were distributed through the applicant's professional and community networks; 280 adults were invited and approximately 200 responded. Participation was voluntary and anonymous.</w:t>
+      </w:r>
+    </w:p>
+    <w:p>
+      <w:r>
+        <w:t>Stage 2 (facility deployment): residents were invited by the facility itself to try the gamified balance activity as a facility activity, under the arrangement made with the facility's operators, nursing staff and general manager (gatekeeper consent). The researcher did not recruit residents directly, and the research purpose was not disclosed at invitation for the scientific reason stated in item 4; the nine persistent participants were individually informed and consented in writing after the eight-week window.</w:t>
+      </w:r>
+    </w:p>
+    <w:p>
+      <w:r>
+        <w:t>Stage 3 (remote decoupled deployment): recruitment was by e-mail invitation through the applicant's networks — family and personal contacts, work contacts, a charity community network, university support channels and medical-centre peers — using a two-tier snowball structure: some recipients participated directly, and some acted as distributors who forwarded the game onward within a target age range and compiled their contacts' returns. Invitation e-mails disclosed the doctoral research context, including the programme's fall-risk origin, and were accompanied by the applicant's research introduction. Participation was voluntary and unpaid; a portion of participants were personally unknown to the applicant.</w:t>
+      </w:r>
+    </w:p>
+    <w:p>
+      <w:r>
+        <w:t>Expert consultations: four professionals were invited directly by the applicant on the basis of their professional standing and relevance (gerontology/medical sociology; neurology; physiotherapy; naturopathic clinical practice).</w:t>
+      </w:r>
+    </w:p>
+    <w:p>
+      <w:pPr>
+        <w:pStyle w:val="Heading1"/>
+      </w:pPr>
+      <w:r>
+        <w:t>8. Inclusion criteria of subjects</w:t>
+      </w:r>
+    </w:p>
+    <w:p>
+      <w:r>
+        <w:t>Stage 1: adults within the invited networks willing to complete the survey.</w:t>
+      </w:r>
+    </w:p>
+    <w:p>
+      <w:r>
+        <w:t>Stage 2: residents of the participating elderly-care facility whom facility staff considered suitable to try the balance-platform activity, and who were willing to try it. Play took place under facility supervision with support rails, per the equipment's standard configuration.</w:t>
+      </w:r>
+    </w:p>
+    <w:p>
+      <w:r>
+        <w:t>Stage 3: adults aged 25-80 (analysed in three bands: 25-44, 45-64, 65-80) with access to a computer or device with a web browser, able to play with trackpad, arrow keys or a foot-pad sensor where available, and able to return the game's results file and the two-item questionnaire by e-mail directly or through their distributor. No gaming experience was required.</w:t>
+      </w:r>
+    </w:p>
+    <w:p>
+      <w:r>
+        <w:t>Expert consultations: professionals with substantial practice or research experience relevant to older adults' health, rehabilitation or health-technology engagement.</w:t>
+      </w:r>
+    </w:p>
+    <w:p>
+      <w:pPr>
+        <w:pStyle w:val="Heading1"/>
+      </w:pPr>
+      <w:r>
+        <w:t>9. Exclusion criteria of subjects</w:t>
+      </w:r>
+    </w:p>
+    <w:p>
+      <w:r>
+        <w:t>The programme applied operational exclusions rather than a formal pre-registered screening protocol; they are stated here as operated.</w:t>
+      </w:r>
+    </w:p>
+    <w:p>
+      <w:r>
+        <w:t>Stage 2: residents whom facility staff judged unsuitable for the standing balance activity were not invited by the facility (safety screening exercised by the facility, which knew its residents); residents who declined were not approached again.</w:t>
+      </w:r>
+    </w:p>
+    <w:p>
+      <w:r>
+        <w:t>Stage 3: returns from persons outside the 25-80 register range were not accepted into the study record (in practice none were received: distributors did not recruit below 25); distributors' own trial plays of the game were excluded from the study record at source; files whose provenance could not be established are excluded from the auditable logbook under the programme's provenance rule.</w:t>
+      </w:r>
+    </w:p>
+    <w:p>
+      <w:r>
+        <w:t>General: no prisoners, minors, or persons lacking capacity were involved at any stage. Stage-2 participants were older adults in residential care and are treated as a potentially vulnerable group; the gatekeeper arrangement and post-hoc individual consent described in item 4 were the protections applied.</w:t>
+      </w:r>
+    </w:p>
+    <w:p>
+      <w:pPr>
+        <w:pStyle w:val="Heading1"/>
+      </w:pPr>
+      <w:r>
+        <w:t>10. Where will the data collection/study take place?</w:t>
+      </w:r>
+    </w:p>
+    <w:p>
+      <w:r>
+        <w:t>Stage 1: within the applicant's professional and community networks [CONFIRM region wording with the supervisor - e.g. Hong Kong / Greater Bay Area].</w:t>
+      </w:r>
+    </w:p>
+    <w:p>
+      <w:r>
+        <w:t>Stage 2: in the rehabilitation room of the participating elderly-care facility [Guangzhou], where the balance-platform FRA station was installed; all sessions took place on site under facility supervision. Facility privacy rules were observed (no photography of participants).</w:t>
+      </w:r>
+    </w:p>
+    <w:p>
+      <w:r>
+        <w:t>Stage 3: no physical study site. The game was a browser build distributed by e-mail; participants played unsupervised on their own devices in their own homes or workplaces, and returned results electronically. Data compilation takes place on the applicant's access-controlled systems.</w:t>
+      </w:r>
+    </w:p>
+    <w:p>
+      <w:r>
+        <w:t>Expert consultations: by telephone (three) and in person in Hong Kong (one), at times and places of the experts' choosing.</w:t>
+      </w:r>
+    </w:p>
+    <w:p>
+      <w:r>
+        <w:t>Data storage for all stages: password-protected, access-controlled systems held by the applicant, with the auditable research archive maintained under the supervision arrangements of the EngD programme.</w:t>
       </w:r>
     </w:p>
     <w:sectPr>

</xml_diff>

<commit_message>
Append HSESC answers Q30-32: retention periods and data confidentiality
Co-Authored-By: Claude Fable 5 <noreply@anthropic.com>
Claude-Session: https://claude.ai/code/session_01KoT3i8geZspYBMMKVYJUTG
</commit_message>
<xml_diff>
--- a/docs/thesis/ethics/HSESC_Application_Basics_Draft.docx
+++ b/docs/thesis/ethics/HSESC_Application_Basics_Draft.docx
@@ -275,6 +275,45 @@
     <w:p>
       <w:r>
         <w:t>Data storage for all stages: password-protected, access-controlled systems held by the applicant, with the auditable research archive maintained under the supervision arrangements of the EngD programme.</w:t>
+      </w:r>
+    </w:p>
+    <w:p>
+      <w:pPr>
+        <w:pStyle w:val="Heading1"/>
+      </w:pPr>
+      <w:r>
+        <w:t>30. Retention of data containing personal identifiers</w:t>
+      </w:r>
+    </w:p>
+    <w:p>
+      <w:r>
+        <w:t>Personal identifiers exist only in the consent and provenance records — signed consent forms, participants' and distributors' e-mail correspondence, and the experts' contact details — and are stored separately from all analysis data, which contain no names. These identifier-bearing records will be retained for ten years after completion of the research (consistent with the retention period stated in the participant information sheet and the University's research-data policy), as the auditable evidence of consent and data provenance supporting the thesis and any papers arising, and will then be securely destroyed (paper records shredded; electronic records deleted from all systems).</w:t>
+      </w:r>
+    </w:p>
+    <w:p>
+      <w:pPr>
+        <w:pStyle w:val="Heading1"/>
+      </w:pPr>
+      <w:r>
+        <w:t>31. Retention of anonymised data</w:t>
+      </w:r>
+    </w:p>
+    <w:p>
+      <w:r>
+        <w:t>Anonymised data (game-session records under participant codes, questionnaire responses recorded against age band, gender and education only, and pseudonymised interview summaries) will be retained for a minimum of ten years after publication of the first paper, as the auditable research archive supporting the thesis and its publications. Fully anonymised aggregate results (counts, percentages, statistical summaries) form part of the published thesis and papers and are retained indefinitely as part of the scholarly record. No retained item permits re-identification of any participant.</w:t>
+      </w:r>
+    </w:p>
+    <w:p>
+      <w:pPr>
+        <w:pStyle w:val="Heading1"/>
+      </w:pPr>
+      <w:r>
+        <w:t>32. Handling, storage and confidentiality of data</w:t>
+      </w:r>
+    </w:p>
+    <w:p>
+      <w:r>
+        <w:t>All electronic records are held on password-protected, access-controlled systems accessible only to the student researcher and the Chief Supervisor; paper records (signed consent forms, questionnaire sheets, interview notes) are kept securely in locked storage. Confidentiality is ensured by separation and pseudonymisation: analysis datasets carry participant codes (e.g. P3001-P3120) with demographic fields limited to age band, gender and education — no names, addresses or contact details; consent forms and correspondence containing identifiers are stored separately from analysis data and are never linked into them. Expert-consultation records follow each expert's documented attribution election: experts who authorised named attribution are identified only as agreed on their signed forms; the expert who elected anonymity is pseudonymised in all outputs, with identity held solely in the separately stored consent record. Interview summaries are returned to participants for validation before use. All reporting is in aggregate or pseudonymised form; no individual is identifiable in the thesis, papers or presentations. The research archive is maintained under version control with a provenance log recording the origin, transmittal date and handling of every data file, supporting audit by the University. At the end of the retention period, identifier-bearing records are securely destroyed.</w:t>
       </w:r>
     </w:p>
     <w:sectPr>

</xml_diff>

<commit_message>
Correct Stage-1 setting in HSESC answers: Poly Group facility Guangzhou, nursing-staff administration, five eligibility criteria
Matches thesis Chapter 4 record: 200 of 280 residents, July-August 2024, management-office screening. Both CONFIRM markers resolved.

Co-Authored-By: Claude Fable 5 <noreply@anthropic.com>
Claude-Session: https://claude.ai/code/session_01KoT3i8geZspYBMMKVYJUTG
</commit_message>
<xml_diff>
--- a/docs/thesis/ethics/HSESC_Application_Basics_Draft.docx
+++ b/docs/thesis/ethics/HSESC_Application_Basics_Draft.docx
@@ -170,7 +170,7 @@
     </w:p>
     <w:p>
       <w:r>
-        <w:t>Stage 1 (survey): invitations were distributed through the applicant's professional and community networks; 280 adults were invited and approximately 200 responded. Participation was voluntary and anonymous.</w:t>
+        <w:t>Stage 1 (survey): conducted at the participating elderly-care facility (Poly Group facility, Guangzhou) in July-August 2024. The facility's management office verified five eligibility criteria before invitation, and the six-item Yes/No survey was administered face-to-face by the facility's nursing staff to 200 eligible residents of the resident population of 280. Face-to-face administration was chosen to reduce literacy and digital-skill barriers. Participation was voluntary and anonymous.</w:t>
       </w:r>
     </w:p>
     <w:p>
@@ -198,7 +198,7 @@
     </w:p>
     <w:p>
       <w:r>
-        <w:t>Stage 1: adults within the invited networks willing to complete the survey.</w:t>
+        <w:t>Stage 1: residents of the participating facility aged 65-88 meeting five criteria verified by the facility's management office: secondary education or above; no significant cognitive impairment; capable of unsupported standing; sufficient vision for screen reading; and no acute mental-health conditions.</w:t>
       </w:r>
     </w:p>
     <w:p>
@@ -231,7 +231,11 @@
     </w:p>
     <w:p>
       <w:r>
-        <w:t>Stage 2: residents whom facility staff judged unsuitable for the standing balance activity were not invited by the facility (safety screening exercised by the facility, which knew its residents); residents who declined were not approached again.</w:t>
+        <w:t>Stage 1: the 80 residents not meeting the five eligibility criteria above were not invited.</w:t>
+        <w:br/>
+      </w:r>
+      <w:r>
+        <w:t xml:space="preserve"> Stage 2: residents whom facility staff judged unsuitable for the standing balance activity were not invited by the facility (safety screening exercised by the facility, which knew its residents); residents who declined were not approached again.</w:t>
       </w:r>
     </w:p>
     <w:p>
@@ -254,12 +258,12 @@
     </w:p>
     <w:p>
       <w:r>
-        <w:t>Stage 1: within the applicant's professional and community networks [CONFIRM region wording with the supervisor - e.g. Hong Kong / Greater Bay Area].</w:t>
+        <w:t>Stage 1: at the participating elderly-care facility — the Poly Group facility in Guangzhou — administered face-to-face on site by the facility's nursing staff.</w:t>
       </w:r>
     </w:p>
     <w:p>
       <w:r>
-        <w:t>Stage 2: in the rehabilitation room of the participating elderly-care facility [Guangzhou], where the balance-platform FRA station was installed; all sessions took place on site under facility supervision. Facility privacy rules were observed (no photography of participants).</w:t>
+        <w:t>Stage 2: in the rehabilitation room of the same facility (Poly Group facility, Guangzhou), where the balance-platform FRA station was installed; all sessions took place on site under facility supervision. Facility privacy rules were observed (no photography of participants).</w:t>
       </w:r>
     </w:p>
     <w:p>

</xml_diff>